<commit_message>
Sprints 5-6: Prometheus/Grafana monitoring, Slack alerts, tests, trigger chain
</commit_message>
<xml_diff>
--- a/docs/Sprint-3 progress.docx
+++ b/docs/Sprint-3 progress.docx
@@ -2502,20 +2502,13 @@
     <w:p/>
     <w:p/>
     <w:p/>
-    <w:p/>
-    <w:p/>
-    <w:p/>
-    <w:p/>
-    <w:p/>
-    <w:p/>
-    <w:p/>
-    <w:p/>
     <w:p>
       <w:pPr>
         <w:pStyle w:val="Heading1"/>
       </w:pPr>
       <w:bookmarkStart w:id="0" w:name="_Toc243086683"/>
       <w:r>
+        <w:lastRenderedPageBreak/>
         <w:t>Local Validation</w:t>
       </w:r>
       <w:bookmarkEnd w:id="0"/>
@@ -2585,7 +2578,6 @@
         <w:rPr>
           <w:noProof/>
         </w:rPr>
-        <w:lastRenderedPageBreak/>
         <w:drawing>
           <wp:inline distT="0" distB="0" distL="0" distR="0" wp14:anchorId="2387798E" wp14:editId="7D98CA08">
             <wp:extent cx="5943600" cy="2133600"/>
@@ -2628,6 +2620,7 @@
         <w:rPr>
           <w:noProof/>
         </w:rPr>
+        <w:lastRenderedPageBreak/>
         <w:drawing>
           <wp:inline distT="0" distB="0" distL="0" distR="0" wp14:anchorId="7C117A48" wp14:editId="2994F0C3">
             <wp:extent cx="5943600" cy="3186430"/>
@@ -2670,7 +2663,6 @@
         <w:rPr>
           <w:noProof/>
         </w:rPr>
-        <w:lastRenderedPageBreak/>
         <w:drawing>
           <wp:inline distT="0" distB="0" distL="0" distR="0" wp14:anchorId="7482596E" wp14:editId="6DCDA97A">
             <wp:extent cx="5943600" cy="3500755"/>
@@ -2713,6 +2705,7 @@
         <w:rPr>
           <w:noProof/>
         </w:rPr>
+        <w:lastRenderedPageBreak/>
         <w:drawing>
           <wp:inline distT="0" distB="0" distL="0" distR="0" wp14:anchorId="70949E30" wp14:editId="3F5FD9D4">
             <wp:extent cx="5943600" cy="3469005"/>
@@ -2755,7 +2748,6 @@
         <w:rPr>
           <w:noProof/>
         </w:rPr>
-        <w:lastRenderedPageBreak/>
         <w:drawing>
           <wp:inline distT="0" distB="0" distL="0" distR="0" wp14:anchorId="36413AE8" wp14:editId="15537F1A">
             <wp:extent cx="5943600" cy="3086735"/>
@@ -2800,6 +2792,7 @@
       </w:pPr>
       <w:bookmarkStart w:id="2" w:name="_Toc243086685"/>
       <w:r>
+        <w:lastRenderedPageBreak/>
         <w:t>Build and run the stack</w:t>
       </w:r>
       <w:bookmarkEnd w:id="2"/>
@@ -2851,7 +2844,6 @@
         <w:rPr>
           <w:noProof/>
         </w:rPr>
-        <w:lastRenderedPageBreak/>
         <w:drawing>
           <wp:inline distT="0" distB="0" distL="0" distR="0" wp14:anchorId="1870677F" wp14:editId="08A7DD2F">
             <wp:extent cx="5943600" cy="3122295"/>
@@ -2978,6 +2970,7 @@
         <w:rPr>
           <w:noProof/>
         </w:rPr>
+        <w:lastRenderedPageBreak/>
         <w:drawing>
           <wp:inline distT="0" distB="0" distL="0" distR="0" wp14:anchorId="5650B367" wp14:editId="340457F2">
             <wp:extent cx="5943600" cy="753745"/>
@@ -3022,7 +3015,6 @@
       </w:pPr>
       <w:bookmarkStart w:id="3" w:name="_Toc243086686"/>
       <w:r>
-        <w:lastRenderedPageBreak/>
         <w:t>AWS account access:</w:t>
       </w:r>
       <w:bookmarkEnd w:id="3"/>
@@ -6523,6 +6515,7 @@
   <w:style w:type="character" w:default="1" w:styleId="DefaultParagraphFont">
     <w:name w:val="Default Paragraph Font"/>
     <w:uiPriority w:val="1"/>
+    <w:semiHidden/>
     <w:unhideWhenUsed/>
   </w:style>
   <w:style w:type="table" w:default="1" w:styleId="TableNormal">

</xml_diff>